<commit_message>
CR-005 section 9: the cell cap subtracts the cell's margins; an SVG value can replace a picture
Jason's two decisions of 2026-10-08. A width=N or width=auto picture in a table cell now fits
the cell's w:tcW less its left and right margins: the cell's w:tcMar, else the table's
w:tblCellMar, else Word's 108 twips each side (the Normal Table style's). imageInfoOf tells an
SVG document by its root element and gives it image/svg+xml with no pixel size, so addImagePart
accepts one and a bind that keeps the drawing points the a:blip at an SVG part, while addImage
refuses it (nothing to place it at) and a width bind over an SVG node is left and noted. What
Word makes of a bare SVG a:blip is unmeasured: check 38's 38b gains control 5 to ask. Tests for
the three margin sources and for SVG both ways; the suite 784.

Co-Authored-By: Claude Fable 5.1 <noreply@anthropic.com>
</commit_message>
<xml_diff>
--- a/test/fixtures/check38/38a-picture-bound.docx
+++ b/test/fixtures/check38/38a-picture-bound.docx
@@ -9,11 +9,11 @@
     </w:p>
     <w:sdt>
       <w:sdtPr>
-        <w:id w:val="984506548"/>
+        <w:id w:val="748903576"/>
         <w:picture/>
         <w:alias w:val="Logo"/>
         <w:tag w:val="logo"/>
-        <w:dataBinding w:storeItemID="{EDC47E12-3F52-45E2-BC3F-648DA6642A3C}" w:xpath="/data/logo"/>
+        <w:dataBinding w:storeItemID="{140CB545-DE87-4E61-9FFD-4CADC113B8EA}" w:xpath="/data/logo"/>
       </w:sdtPr>
       <w:sdtContent>
         <w:p>
@@ -891,5 +891,5 @@
 </file>
 
 <file path=customXml/itemProps1.xml><?xml version="1.0" encoding="utf-8"?>
-<ds:datastoreItem xmlns:ds="http://schemas.openxmlformats.org/officeDocument/2006/customXml" ds:itemID="{EDC47E12-3F52-45E2-BC3F-648DA6642A3C}"/>
+<ds:datastoreItem xmlns:ds="http://schemas.openxmlformats.org/officeDocument/2006/customXml" ds:itemID="{140CB545-DE87-4E61-9FFD-4CADC113B8EA}"/>
 </file>
</xml_diff>